<commit_message>
docs: embed 6 high-resolution screenshot figures into Word Document assignment report
</commit_message>
<xml_diff>
--- a/Agile docker/Sprint_Jenkins_CI_Chatbot_Report.docx
+++ b/Agile docker/Sprint_Jenkins_CI_Chatbot_Report.docx
@@ -423,6 +423,60 @@
     </w:p>
     <w:p>
       <w:pPr>
+        <w:spacing w:before="160" w:after="40"/>
+        <w:jc w:val="center"/>
+      </w:pPr>
+      <w:r>
+        <w:drawing>
+          <wp:inline xmlns:a="http://schemas.openxmlformats.org/drawingml/2006/main" xmlns:pic="http://schemas.openxmlformats.org/drawingml/2006/picture">
+            <wp:extent cx="5303520" cy="2519172"/>
+            <wp:docPr id="1" name="Picture 1"/>
+            <wp:cNvGraphicFramePr>
+              <a:graphicFrameLocks noChangeAspect="1"/>
+            </wp:cNvGraphicFramePr>
+            <a:graphic>
+              <a:graphicData uri="http://schemas.openxmlformats.org/drawingml/2006/picture">
+                <pic:pic>
+                  <pic:nvPicPr>
+                    <pic:cNvPr id="0" name="screenshot1_chatbot_ui.png"/>
+                    <pic:cNvPicPr/>
+                  </pic:nvPicPr>
+                  <pic:blipFill>
+                    <a:blip r:embed="rId9"/>
+                    <a:stretch>
+                      <a:fillRect/>
+                    </a:stretch>
+                  </pic:blipFill>
+                  <pic:spPr>
+                    <a:xfrm>
+                      <a:off x="0" y="0"/>
+                      <a:ext cx="5303520" cy="2519172"/>
+                    </a:xfrm>
+                    <a:prstGeom prst="rect"/>
+                  </pic:spPr>
+                </pic:pic>
+              </a:graphicData>
+            </a:graphic>
+          </wp:inline>
+        </w:drawing>
+      </w:r>
+    </w:p>
+    <w:p>
+      <w:pPr>
+        <w:spacing w:after="240"/>
+        <w:jc w:val="center"/>
+      </w:pPr>
+      <w:r>
+        <w:rPr>
+          <w:i/>
+          <w:color w:val="475569"/>
+          <w:sz w:val="19"/>
+        </w:rPr>
+        <w:t>Figure Evidence: Live Web Interface of OmniBot Assistant Processing Math Calculations and Greetings (http://localhost:3000)</w:t>
+      </w:r>
+    </w:p>
+    <w:p>
+      <w:pPr>
         <w:pStyle w:val="Heading1"/>
         <w:keepNext/>
         <w:spacing w:before="280" w:after="120"/>
@@ -537,6 +591,60 @@
       </w:r>
       <w:r>
         <w:t>Created a Pipeline job named 'OmniBot_CI_Pipeline', set definition to 'Pipeline script from SCM', specified Git URL https://github.com/imyashwanthsdp/omnibot.git, branch */main, and script path Jenkinsfile.</w:t>
+      </w:r>
+    </w:p>
+    <w:p>
+      <w:pPr>
+        <w:spacing w:before="160" w:after="40"/>
+        <w:jc w:val="center"/>
+      </w:pPr>
+      <w:r>
+        <w:drawing>
+          <wp:inline xmlns:a="http://schemas.openxmlformats.org/drawingml/2006/main" xmlns:pic="http://schemas.openxmlformats.org/drawingml/2006/picture">
+            <wp:extent cx="5303520" cy="2757830"/>
+            <wp:docPr id="2" name="Picture 2"/>
+            <wp:cNvGraphicFramePr>
+              <a:graphicFrameLocks noChangeAspect="1"/>
+            </wp:cNvGraphicFramePr>
+            <a:graphic>
+              <a:graphicData uri="http://schemas.openxmlformats.org/drawingml/2006/picture">
+                <pic:pic>
+                  <pic:nvPicPr>
+                    <pic:cNvPr id="0" name="screenshot2_jenkins_webhook.png"/>
+                    <pic:cNvPicPr/>
+                  </pic:nvPicPr>
+                  <pic:blipFill>
+                    <a:blip r:embed="rId10"/>
+                    <a:stretch>
+                      <a:fillRect/>
+                    </a:stretch>
+                  </pic:blipFill>
+                  <pic:spPr>
+                    <a:xfrm>
+                      <a:off x="0" y="0"/>
+                      <a:ext cx="5303520" cy="2757830"/>
+                    </a:xfrm>
+                    <a:prstGeom prst="rect"/>
+                  </pic:spPr>
+                </pic:pic>
+              </a:graphicData>
+            </a:graphic>
+          </wp:inline>
+        </w:drawing>
+      </w:r>
+    </w:p>
+    <w:p>
+      <w:pPr>
+        <w:spacing w:after="240"/>
+        <w:jc w:val="center"/>
+      </w:pPr>
+      <w:r>
+        <w:rPr>
+          <w:i/>
+          <w:color w:val="475569"/>
+          <w:sz w:val="19"/>
+        </w:rPr>
+        <w:t>Figure Evidence: Active GitHub Webhook Configuration pointing to Jenkins Payload URL with Response 200 OK</w:t>
       </w:r>
     </w:p>
     <w:p>
@@ -867,7 +975,7 @@
               <w:br/>
               <w:t>STAGE 5: PIPELINE EXECUTION RESULT SUMMARY</w:t>
               <w:br/>
-              <w:t>SUCCESS: Jenkins CI Pipeline Completed!</w:t>
+              <w:t>SUCCESS: Jenkins CI Pipeline Completed!"</w:t>
               <w:br/>
               <w:t>Build Number: #1 | Docker Tag: general-chatbot-app:build-1</w:t>
               <w:br/>
@@ -881,6 +989,168 @@
       <w:pPr>
         <w:spacing w:after="120"/>
       </w:pPr>
+    </w:p>
+    <w:p>
+      <w:pPr>
+        <w:spacing w:before="160" w:after="40"/>
+        <w:jc w:val="center"/>
+      </w:pPr>
+      <w:r>
+        <w:drawing>
+          <wp:inline xmlns:a="http://schemas.openxmlformats.org/drawingml/2006/main" xmlns:pic="http://schemas.openxmlformats.org/drawingml/2006/picture">
+            <wp:extent cx="5303520" cy="3076042"/>
+            <wp:docPr id="3" name="Picture 3"/>
+            <wp:cNvGraphicFramePr>
+              <a:graphicFrameLocks noChangeAspect="1"/>
+            </wp:cNvGraphicFramePr>
+            <a:graphic>
+              <a:graphicData uri="http://schemas.openxmlformats.org/drawingml/2006/picture">
+                <pic:pic>
+                  <pic:nvPicPr>
+                    <pic:cNvPr id="0" name="screenshot3_unit_tests.png"/>
+                    <pic:cNvPicPr/>
+                  </pic:nvPicPr>
+                  <pic:blipFill>
+                    <a:blip r:embed="rId11"/>
+                    <a:stretch>
+                      <a:fillRect/>
+                    </a:stretch>
+                  </pic:blipFill>
+                  <pic:spPr>
+                    <a:xfrm>
+                      <a:off x="0" y="0"/>
+                      <a:ext cx="5303520" cy="3076042"/>
+                    </a:xfrm>
+                    <a:prstGeom prst="rect"/>
+                  </pic:spPr>
+                </pic:pic>
+              </a:graphicData>
+            </a:graphic>
+          </wp:inline>
+        </w:drawing>
+      </w:r>
+    </w:p>
+    <w:p>
+      <w:pPr>
+        <w:spacing w:after="240"/>
+        <w:jc w:val="center"/>
+      </w:pPr>
+      <w:r>
+        <w:rPr>
+          <w:i/>
+          <w:color w:val="475569"/>
+          <w:sz w:val="19"/>
+        </w:rPr>
+        <w:t>Figure Evidence: Automated Unit Test Execution Logs (npm test) Showing 6/6 Tests Passing in TAP Format</w:t>
+      </w:r>
+    </w:p>
+    <w:p>
+      <w:pPr>
+        <w:spacing w:before="160" w:after="40"/>
+        <w:jc w:val="center"/>
+      </w:pPr>
+      <w:r>
+        <w:drawing>
+          <wp:inline xmlns:a="http://schemas.openxmlformats.org/drawingml/2006/main" xmlns:pic="http://schemas.openxmlformats.org/drawingml/2006/picture">
+            <wp:extent cx="5303520" cy="3076042"/>
+            <wp:docPr id="4" name="Picture 4"/>
+            <wp:cNvGraphicFramePr>
+              <a:graphicFrameLocks noChangeAspect="1"/>
+            </wp:cNvGraphicFramePr>
+            <a:graphic>
+              <a:graphicData uri="http://schemas.openxmlformats.org/drawingml/2006/picture">
+                <pic:pic>
+                  <pic:nvPicPr>
+                    <pic:cNvPr id="0" name="screenshot4_docker_build.png"/>
+                    <pic:cNvPicPr/>
+                  </pic:nvPicPr>
+                  <pic:blipFill>
+                    <a:blip r:embed="rId12"/>
+                    <a:stretch>
+                      <a:fillRect/>
+                    </a:stretch>
+                  </pic:blipFill>
+                  <pic:spPr>
+                    <a:xfrm>
+                      <a:off x="0" y="0"/>
+                      <a:ext cx="5303520" cy="3076042"/>
+                    </a:xfrm>
+                    <a:prstGeom prst="rect"/>
+                  </pic:spPr>
+                </pic:pic>
+              </a:graphicData>
+            </a:graphic>
+          </wp:inline>
+        </w:drawing>
+      </w:r>
+    </w:p>
+    <w:p>
+      <w:pPr>
+        <w:spacing w:after="240"/>
+        <w:jc w:val="center"/>
+      </w:pPr>
+      <w:r>
+        <w:rPr>
+          <w:i/>
+          <w:color w:val="475569"/>
+          <w:sz w:val="19"/>
+        </w:rPr>
+        <w:t>Figure Evidence: Docker Build and Tag Verification Output Listing general-chatbot-app:build-1 Image Tag</w:t>
+      </w:r>
+    </w:p>
+    <w:p>
+      <w:pPr>
+        <w:spacing w:before="160" w:after="40"/>
+        <w:jc w:val="center"/>
+      </w:pPr>
+      <w:r>
+        <w:drawing>
+          <wp:inline xmlns:a="http://schemas.openxmlformats.org/drawingml/2006/main" xmlns:pic="http://schemas.openxmlformats.org/drawingml/2006/picture">
+            <wp:extent cx="5303520" cy="2545690"/>
+            <wp:docPr id="5" name="Picture 5"/>
+            <wp:cNvGraphicFramePr>
+              <a:graphicFrameLocks noChangeAspect="1"/>
+            </wp:cNvGraphicFramePr>
+            <a:graphic>
+              <a:graphicData uri="http://schemas.openxmlformats.org/drawingml/2006/picture">
+                <pic:pic>
+                  <pic:nvPicPr>
+                    <pic:cNvPr id="0" name="screenshot5_jenkins_stageview.png"/>
+                    <pic:cNvPicPr/>
+                  </pic:nvPicPr>
+                  <pic:blipFill>
+                    <a:blip r:embed="rId13"/>
+                    <a:stretch>
+                      <a:fillRect/>
+                    </a:stretch>
+                  </pic:blipFill>
+                  <pic:spPr>
+                    <a:xfrm>
+                      <a:off x="0" y="0"/>
+                      <a:ext cx="5303520" cy="2545690"/>
+                    </a:xfrm>
+                    <a:prstGeom prst="rect"/>
+                  </pic:spPr>
+                </pic:pic>
+              </a:graphicData>
+            </a:graphic>
+          </wp:inline>
+        </w:drawing>
+      </w:r>
+    </w:p>
+    <w:p>
+      <w:pPr>
+        <w:spacing w:after="240"/>
+        <w:jc w:val="center"/>
+      </w:pPr>
+      <w:r>
+        <w:rPr>
+          <w:i/>
+          <w:color w:val="475569"/>
+          <w:sz w:val="19"/>
+        </w:rPr>
+        <w:t>Figure Evidence: Jenkins Pipeline Stage Execution View Displaying 5 Green Passing Stages for Build #1</w:t>
+      </w:r>
     </w:p>
     <w:p>
       <w:pPr>
@@ -996,6 +1266,60 @@
       <w:pPr>
         <w:spacing w:after="120"/>
       </w:pPr>
+    </w:p>
+    <w:p>
+      <w:pPr>
+        <w:spacing w:before="160" w:after="40"/>
+        <w:jc w:val="center"/>
+      </w:pPr>
+      <w:r>
+        <w:drawing>
+          <wp:inline xmlns:a="http://schemas.openxmlformats.org/drawingml/2006/main" xmlns:pic="http://schemas.openxmlformats.org/drawingml/2006/picture">
+            <wp:extent cx="5303520" cy="3076042"/>
+            <wp:docPr id="6" name="Picture 6"/>
+            <wp:cNvGraphicFramePr>
+              <a:graphicFrameLocks noChangeAspect="1"/>
+            </wp:cNvGraphicFramePr>
+            <a:graphic>
+              <a:graphicData uri="http://schemas.openxmlformats.org/drawingml/2006/picture">
+                <pic:pic>
+                  <pic:nvPicPr>
+                    <pic:cNvPr id="0" name="screenshot6_github_commits.png"/>
+                    <pic:cNvPicPr/>
+                  </pic:nvPicPr>
+                  <pic:blipFill>
+                    <a:blip r:embed="rId14"/>
+                    <a:stretch>
+                      <a:fillRect/>
+                    </a:stretch>
+                  </pic:blipFill>
+                  <pic:spPr>
+                    <a:xfrm>
+                      <a:off x="0" y="0"/>
+                      <a:ext cx="5303520" cy="3076042"/>
+                    </a:xfrm>
+                    <a:prstGeom prst="rect"/>
+                  </pic:spPr>
+                </pic:pic>
+              </a:graphicData>
+            </a:graphic>
+          </wp:inline>
+        </w:drawing>
+      </w:r>
+    </w:p>
+    <w:p>
+      <w:pPr>
+        <w:spacing w:after="240"/>
+        <w:jc w:val="center"/>
+      </w:pPr>
+      <w:r>
+        <w:rPr>
+          <w:i/>
+          <w:color w:val="475569"/>
+          <w:sz w:val="19"/>
+        </w:rPr>
+        <w:t>Figure Evidence: Git Commit History and Terminal Output Demonstrating Automated Push to GitHub Repository</w:t>
+      </w:r>
     </w:p>
     <w:p>
       <w:pPr>

</xml_diff>